<commit_message>
typo in manual and README actualization
</commit_message>
<xml_diff>
--- a/Data_Tariffs_and_Forest_Stock/Manual/Scenario_input_data_generation_TradeTariffs_Forest_2023.docx
+++ b/Data_Tariffs_and_Forest_Stock/Manual/Scenario_input_data_generation_TradeTariffs_Forest_2023.docx
@@ -55,31 +55,7 @@
           <w:szCs w:val="48"/>
           <w:lang w:val="en-US"/>
         </w:rPr>
-        <w:t xml:space="preserve"> for </w:t>
-      </w:r>
-      <w:proofErr w:type="spellStart"/>
-      <w:r>
-        <w:rPr>
-          <w:rFonts w:ascii="Times New Roman" w:hAnsi="Times New Roman" w:cs="Times New Roman"/>
-          <w:b/>
-          <w:bCs/>
-          <w:sz w:val="48"/>
-          <w:szCs w:val="48"/>
-          <w:lang w:val="en-US"/>
-        </w:rPr>
-        <w:t>TiMBA</w:t>
-      </w:r>
-      <w:proofErr w:type="spellEnd"/>
-      <w:r>
-        <w:rPr>
-          <w:rFonts w:ascii="Times New Roman" w:hAnsi="Times New Roman" w:cs="Times New Roman"/>
-          <w:b/>
-          <w:bCs/>
-          <w:sz w:val="48"/>
-          <w:szCs w:val="48"/>
-          <w:lang w:val="en-US"/>
-        </w:rPr>
-        <w:t xml:space="preserve"> </w:t>
+        <w:t xml:space="preserve"> for TiMBA </w:t>
       </w:r>
     </w:p>
     <w:p>
@@ -1271,21 +1247,7 @@
         <w:rPr>
           <w:lang w:val="en-US"/>
         </w:rPr>
-        <w:t xml:space="preserve">Trade in </w:t>
-      </w:r>
-      <w:proofErr w:type="spellStart"/>
-      <w:r>
-        <w:rPr>
-          <w:lang w:val="en-US"/>
-        </w:rPr>
-        <w:t>TiMBA</w:t>
-      </w:r>
-      <w:proofErr w:type="spellEnd"/>
-      <w:r>
-        <w:rPr>
-          <w:lang w:val="en-US"/>
-        </w:rPr>
-        <w:t xml:space="preserve"> depends</w:t>
+        <w:t>Trade in TiMBA depends</w:t>
       </w:r>
       <w:r>
         <w:rPr>
@@ -1849,21 +1811,7 @@
         <w:rPr>
           <w:lang w:val="en-US"/>
         </w:rPr>
-        <w:t xml:space="preserve">. However, in some cases, a product in the </w:t>
-      </w:r>
-      <w:proofErr w:type="spellStart"/>
-      <w:r>
-        <w:rPr>
-          <w:lang w:val="en-US"/>
-        </w:rPr>
-        <w:t>TiMBA</w:t>
-      </w:r>
-      <w:proofErr w:type="spellEnd"/>
-      <w:r>
-        <w:rPr>
-          <w:lang w:val="en-US"/>
-        </w:rPr>
-        <w:t xml:space="preserve"> model framework is represented by</w:t>
+        <w:t>. However, in some cases, a product in the TiMBA model framework is represented by</w:t>
       </w:r>
       <w:r>
         <w:rPr>
@@ -1960,27 +1908,7 @@
           <w:szCs w:val="24"/>
           <w:lang w:val="en-US"/>
         </w:rPr>
-        <w:t xml:space="preserve"> used in the </w:t>
-      </w:r>
-      <w:proofErr w:type="spellStart"/>
-      <w:r>
-        <w:rPr>
-          <w:rFonts w:ascii="Times New Roman" w:hAnsi="Times New Roman" w:cs="Times New Roman"/>
-          <w:sz w:val="24"/>
-          <w:szCs w:val="24"/>
-          <w:lang w:val="en-US"/>
-        </w:rPr>
-        <w:t>TiMBA</w:t>
-      </w:r>
-      <w:proofErr w:type="spellEnd"/>
-      <w:r>
-        <w:rPr>
-          <w:rFonts w:ascii="Times New Roman" w:hAnsi="Times New Roman" w:cs="Times New Roman"/>
-          <w:sz w:val="24"/>
-          <w:szCs w:val="24"/>
-          <w:lang w:val="en-US"/>
-        </w:rPr>
-        <w:t xml:space="preserve"> scenario input file</w:t>
+        <w:t xml:space="preserve"> used in the TiMBA scenario input file</w:t>
       </w:r>
       <w:r>
         <w:rPr>
@@ -2213,21 +2141,7 @@
         <w:rPr>
           <w:lang w:val="en-US"/>
         </w:rPr>
-        <w:t xml:space="preserve"> as (mean) ad valorem rates on the 4-digit or 6-digit code level. Prerequisite for the former case is, that the product representation in </w:t>
-      </w:r>
-      <w:proofErr w:type="spellStart"/>
-      <w:r>
-        <w:rPr>
-          <w:lang w:val="en-US"/>
-        </w:rPr>
-        <w:t>TiMBA</w:t>
-      </w:r>
-      <w:proofErr w:type="spellEnd"/>
-      <w:r>
-        <w:rPr>
-          <w:lang w:val="en-US"/>
-        </w:rPr>
-        <w:t xml:space="preserve"> is congruent with the 4-digit level in the HS system.  </w:t>
+        <w:t xml:space="preserve"> as (mean) ad valorem rates on the 4-digit or 6-digit code level. Prerequisite for the former case is, that the product representation in TiMBA is congruent with the 4-digit level in the HS system.  </w:t>
       </w:r>
     </w:p>
     <w:p>
@@ -2241,21 +2155,7 @@
         <w:rPr>
           <w:lang w:val="en-US"/>
         </w:rPr>
-        <w:t xml:space="preserve">Some products are represented by more than one 4-digit and / or 6-digit HS code. When this occurs, the tariffs for these codes are treated separately for the calculation, and the final ad valorem rate reflects the aggregate or a representative value based on the available data. In case that a product in </w:t>
-      </w:r>
-      <w:proofErr w:type="spellStart"/>
-      <w:r>
-        <w:rPr>
-          <w:lang w:val="en-US"/>
-        </w:rPr>
-        <w:t>TiMBA</w:t>
-      </w:r>
-      <w:proofErr w:type="spellEnd"/>
-      <w:r>
-        <w:rPr>
-          <w:lang w:val="en-US"/>
-        </w:rPr>
-        <w:t xml:space="preserve"> is composed of </w:t>
+        <w:t xml:space="preserve">Some products are represented by more than one 4-digit and / or 6-digit HS code. When this occurs, the tariffs for these codes are treated separately for the calculation, and the final ad valorem rate reflects the aggregate or a representative value based on the available data. In case that a product in TiMBA is composed of </w:t>
       </w:r>
       <w:r>
         <w:rPr>
@@ -2270,7 +2170,23 @@
           <w:rFonts w:eastAsiaTheme="majorEastAsia"/>
           <w:lang w:val="en-US"/>
         </w:rPr>
-        <w:t xml:space="preserve"> (see Table x), the ad valorem rate is c</w:t>
+        <w:t xml:space="preserve"> (see Table </w:t>
+      </w:r>
+      <w:r>
+        <w:rPr>
+          <w:rStyle w:val="Strong"/>
+          <w:rFonts w:eastAsiaTheme="majorEastAsia"/>
+          <w:lang w:val="en-US"/>
+        </w:rPr>
+        <w:t>1</w:t>
+      </w:r>
+      <w:r>
+        <w:rPr>
+          <w:rStyle w:val="Strong"/>
+          <w:rFonts w:eastAsiaTheme="majorEastAsia"/>
+          <w:lang w:val="en-US"/>
+        </w:rPr>
+        <w:t>), the ad valorem rate is c</w:t>
       </w:r>
       <w:r>
         <w:rPr>
@@ -2535,7 +2451,6 @@
                 <w:lang w:val="en-US"/>
               </w:rPr>
             </w:pPr>
-            <w:proofErr w:type="spellStart"/>
             <w:r>
               <w:rPr>
                 <w:rFonts w:ascii="Times New Roman" w:eastAsia="Times New Roman" w:hAnsi="Times New Roman" w:cs="Times New Roman"/>
@@ -2551,17 +2466,7 @@
                 <w:szCs w:val="20"/>
                 <w:lang w:val="en-US"/>
               </w:rPr>
-              <w:t>ustrial</w:t>
-            </w:r>
-            <w:proofErr w:type="spellEnd"/>
-            <w:r>
-              <w:rPr>
-                <w:rFonts w:ascii="Times New Roman" w:eastAsia="Times New Roman" w:hAnsi="Times New Roman" w:cs="Times New Roman"/>
-                <w:sz w:val="20"/>
-                <w:szCs w:val="20"/>
-                <w:lang w:val="en-US"/>
-              </w:rPr>
-              <w:t xml:space="preserve"> R</w:t>
+              <w:t>ustrial R</w:t>
             </w:r>
             <w:r>
               <w:rPr>
@@ -3418,21 +3323,7 @@
         <w:rPr>
           <w:lang w:val="en-US"/>
         </w:rPr>
-        <w:t xml:space="preserve"> for 180 countries, as considered in the </w:t>
-      </w:r>
-      <w:proofErr w:type="spellStart"/>
-      <w:r>
-        <w:rPr>
-          <w:lang w:val="en-US"/>
-        </w:rPr>
-        <w:t>TiMBA</w:t>
-      </w:r>
-      <w:proofErr w:type="spellEnd"/>
-      <w:r>
-        <w:rPr>
-          <w:lang w:val="en-US"/>
-        </w:rPr>
-        <w:t xml:space="preserve"> model. While data on forest area and forest </w:t>
+        <w:t xml:space="preserve"> for 180 countries, as considered in the TiMBA model. While data on forest area and forest </w:t>
       </w:r>
       <w:r>
         <w:rPr>
@@ -3615,21 +3506,7 @@
         <w:rPr>
           <w:lang w:val="en-US"/>
         </w:rPr>
-        <w:t xml:space="preserve"> methodology ensures that the data used in the </w:t>
-      </w:r>
-      <w:proofErr w:type="spellStart"/>
-      <w:r>
-        <w:rPr>
-          <w:lang w:val="en-US"/>
-        </w:rPr>
-        <w:t>TiMBA</w:t>
-      </w:r>
-      <w:proofErr w:type="spellEnd"/>
-      <w:r>
-        <w:rPr>
-          <w:lang w:val="en-US"/>
-        </w:rPr>
-        <w:t xml:space="preserve"> model is as consistent and reliable as possible, despite the fragmented nature of global forest stock data.</w:t>
+        <w:t xml:space="preserve"> methodology ensures that the data used in the TiMBA model is as consistent and reliable as possible, despite the fragmented nature of global forest stock data.</w:t>
       </w:r>
     </w:p>
     <w:p>
@@ -3758,27 +3635,7 @@
           <w:szCs w:val="24"/>
           <w:lang w:val="en-US"/>
         </w:rPr>
-        <w:t xml:space="preserve"> and from FRA 2025 for </w:t>
-      </w:r>
-      <w:proofErr w:type="spellStart"/>
-      <w:r>
-        <w:rPr>
-          <w:rFonts w:ascii="Times New Roman" w:eastAsia="Times New Roman" w:hAnsi="Times New Roman" w:cs="Times New Roman"/>
-          <w:sz w:val="24"/>
-          <w:szCs w:val="24"/>
-          <w:lang w:val="en-US"/>
-        </w:rPr>
-        <w:t>TiMBA</w:t>
-      </w:r>
-      <w:proofErr w:type="spellEnd"/>
-      <w:r>
-        <w:rPr>
-          <w:rFonts w:ascii="Times New Roman" w:eastAsia="Times New Roman" w:hAnsi="Times New Roman" w:cs="Times New Roman"/>
-          <w:sz w:val="24"/>
-          <w:szCs w:val="24"/>
-          <w:lang w:val="en-US"/>
-        </w:rPr>
-        <w:t xml:space="preserve"> scenario input files with 2021 or later as starting year</w:t>
+        <w:t xml:space="preserve"> and from FRA 2025 for TiMBA scenario input files with 2021 or later as starting year</w:t>
       </w:r>
       <w:r>
         <w:rPr>
@@ -4180,19 +4037,8 @@
           <w:szCs w:val="24"/>
           <w:lang w:val="en-US"/>
         </w:rPr>
-        <w:t xml:space="preserve"> forest growing stock was calculated using data from the </w:t>
-      </w:r>
-      <w:proofErr w:type="spellStart"/>
-      <w:r>
-        <w:rPr>
-          <w:rFonts w:ascii="Times New Roman" w:eastAsia="Times New Roman" w:hAnsi="Times New Roman" w:cs="Times New Roman"/>
-          <w:sz w:val="24"/>
-          <w:szCs w:val="24"/>
-          <w:lang w:val="en-US"/>
-        </w:rPr>
-        <w:t>GlobalForestWatch</w:t>
-      </w:r>
-      <w:proofErr w:type="spellEnd"/>
+        <w:t xml:space="preserve"> forest growing stock was calculated using data from the GlobalForestWatch</w:t>
+      </w:r>
       <w:r>
         <w:rPr>
           <w:rFonts w:ascii="Times New Roman" w:eastAsia="Times New Roman" w:hAnsi="Times New Roman" w:cs="Times New Roman"/>
@@ -4301,27 +4147,7 @@
           <w:szCs w:val="24"/>
           <w:lang w:val="en-US"/>
         </w:rPr>
-        <w:t xml:space="preserve">For the estimation of forest stock growth in </w:t>
-      </w:r>
-      <w:proofErr w:type="spellStart"/>
-      <w:r>
-        <w:rPr>
-          <w:rFonts w:ascii="Times New Roman" w:eastAsia="Times New Roman" w:hAnsi="Times New Roman" w:cs="Times New Roman"/>
-          <w:sz w:val="24"/>
-          <w:szCs w:val="24"/>
-          <w:lang w:val="en-US"/>
-        </w:rPr>
-        <w:t>TiMBA</w:t>
-      </w:r>
-      <w:proofErr w:type="spellEnd"/>
-      <w:r>
-        <w:rPr>
-          <w:rFonts w:ascii="Times New Roman" w:eastAsia="Times New Roman" w:hAnsi="Times New Roman" w:cs="Times New Roman"/>
-          <w:sz w:val="24"/>
-          <w:szCs w:val="24"/>
-          <w:lang w:val="en-US"/>
-        </w:rPr>
-        <w:t xml:space="preserve">, the objective is to derive the biological growth of forest growing stock independent of harvest removals. Since the growing stock values reported in the FAO </w:t>
+        <w:t xml:space="preserve">For the estimation of forest stock growth in TiMBA, the objective is to derive the biological growth of forest growing stock independent of harvest removals. Since the growing stock values reported in the FAO </w:t>
       </w:r>
       <w:r>
         <w:rPr>
@@ -4360,27 +4186,7 @@
           <w:lang w:val="en-US"/>
         </w:rPr>
         <w:lastRenderedPageBreak/>
-        <w:t xml:space="preserve">For </w:t>
-      </w:r>
-      <w:proofErr w:type="spellStart"/>
-      <w:r>
-        <w:rPr>
-          <w:rFonts w:ascii="Times New Roman" w:eastAsia="Times New Roman" w:hAnsi="Times New Roman" w:cs="Times New Roman"/>
-          <w:sz w:val="24"/>
-          <w:szCs w:val="24"/>
-          <w:lang w:val="en-US"/>
-        </w:rPr>
-        <w:t>TiMBA</w:t>
-      </w:r>
-      <w:proofErr w:type="spellEnd"/>
-      <w:r>
-        <w:rPr>
-          <w:rFonts w:ascii="Times New Roman" w:eastAsia="Times New Roman" w:hAnsi="Times New Roman" w:cs="Times New Roman"/>
-          <w:sz w:val="24"/>
-          <w:szCs w:val="24"/>
-          <w:lang w:val="en-US"/>
-        </w:rPr>
-        <w:t xml:space="preserve"> scenario input files with a starting year of 2020, annual forest stock growth rates were derived from the development of forest growing stock between 2015 and 2020. For scenario input files with starting years of 2021 or later, the respective period 2020–2025 was used.</w:t>
+        <w:t>For TiMBA scenario input files with a starting year of 2020, annual forest stock growth rates were derived from the development of forest growing stock between 2015 and 2020. For scenario input files with starting years of 2021 or later, the respective period 2020–2025 was used.</w:t>
       </w:r>
     </w:p>
     <w:p>
@@ -4418,38 +4224,16 @@
           <w:szCs w:val="24"/>
           <w:lang w:val="en-US"/>
         </w:rPr>
-        <w:t xml:space="preserve"> FRA. This adjustment reconstructs the growing stock level that would have been reached in the absence of harvest </w:t>
-      </w:r>
-      <w:proofErr w:type="spellStart"/>
-      <w:proofErr w:type="gramStart"/>
-      <w:r>
-        <w:rPr>
-          <w:rFonts w:ascii="Times New Roman" w:eastAsia="Times New Roman" w:hAnsi="Times New Roman" w:cs="Times New Roman"/>
-          <w:sz w:val="24"/>
-          <w:szCs w:val="24"/>
-          <w:lang w:val="en-US"/>
-        </w:rPr>
-        <w:t>removals.</w:t>
-      </w:r>
-      <w:r>
-        <w:rPr>
-          <w:rFonts w:ascii="Times New Roman" w:eastAsia="Times New Roman" w:hAnsi="Times New Roman" w:cs="Times New Roman"/>
-          <w:sz w:val="24"/>
-          <w:szCs w:val="24"/>
-          <w:lang w:val="en-US"/>
-        </w:rPr>
-        <w:t>For</w:t>
-      </w:r>
-      <w:proofErr w:type="spellEnd"/>
-      <w:proofErr w:type="gramEnd"/>
-      <w:r>
-        <w:rPr>
-          <w:rFonts w:ascii="Times New Roman" w:eastAsia="Times New Roman" w:hAnsi="Times New Roman" w:cs="Times New Roman"/>
-          <w:sz w:val="24"/>
-          <w:szCs w:val="24"/>
-          <w:lang w:val="en-US"/>
-        </w:rPr>
-        <w:t xml:space="preserve"> the period 2015–2020, the adjusted growing stock was calculated as:</w:t>
+        <w:t xml:space="preserve"> FRA. This adjustment reconstructs the growing stock level that would have been reached in the absence of harvest removals.</w:t>
+      </w:r>
+      <w:r>
+        <w:rPr>
+          <w:rFonts w:ascii="Times New Roman" w:eastAsia="Times New Roman" w:hAnsi="Times New Roman" w:cs="Times New Roman"/>
+          <w:sz w:val="24"/>
+          <w:szCs w:val="24"/>
+          <w:lang w:val="en-US"/>
+        </w:rPr>
+        <w:t>For the period 2015–2020, the adjusted growing stock was calculated as:</w:t>
       </w:r>
     </w:p>
     <w:p>
@@ -5900,43 +5684,13 @@
         <w:rPr>
           <w:lang w:val="en-US"/>
         </w:rPr>
-        <w:t xml:space="preserve">The resulting values provide a harmonized estimate of country-level forest stock growth consistent with the conceptual requirements of the </w:t>
-      </w:r>
-      <w:proofErr w:type="spellStart"/>
-      <w:r>
-        <w:rPr>
-          <w:lang w:val="en-US"/>
-        </w:rPr>
-        <w:t>TiMBA</w:t>
-      </w:r>
-      <w:proofErr w:type="spellEnd"/>
-      <w:r>
-        <w:rPr>
-          <w:lang w:val="en-US"/>
-        </w:rPr>
-        <w:t xml:space="preserve"> model, namely the representation of biological forest growth independent of harvest-induced stock </w:t>
-      </w:r>
-      <w:proofErr w:type="spellStart"/>
-      <w:proofErr w:type="gramStart"/>
-      <w:r>
-        <w:rPr>
-          <w:lang w:val="en-US"/>
-        </w:rPr>
-        <w:t>reductions.</w:t>
-      </w:r>
-      <w:r>
-        <w:rPr>
-          <w:lang w:val="en-US"/>
-        </w:rPr>
-        <w:t>The</w:t>
-      </w:r>
-      <w:proofErr w:type="spellEnd"/>
-      <w:proofErr w:type="gramEnd"/>
-      <w:r>
-        <w:rPr>
-          <w:lang w:val="en-US"/>
-        </w:rPr>
-        <w:t xml:space="preserve"> values for forest growing stock and annual forest stock growth are provided in the accompanying table.</w:t>
+        <w:t>The resulting values provide a harmonized estimate of country-level forest stock growth consistent with the conceptual requirements of the TiMBA model, namely the representation of biological forest growth independent of harvest-induced stock reductions.</w:t>
+      </w:r>
+      <w:r>
+        <w:rPr>
+          <w:lang w:val="en-US"/>
+        </w:rPr>
+        <w:t>The values for forest growing stock and annual forest stock growth are provided in the accompanying table.</w:t>
       </w:r>
     </w:p>
     <w:p>
@@ -6268,46 +6022,14 @@
           <w:rFonts w:ascii="Times New Roman" w:hAnsi="Times New Roman" w:cs="Times New Roman"/>
           <w:lang w:val="en-US"/>
         </w:rPr>
-        <w:t xml:space="preserve"> Stock growth caped at the </w:t>
-      </w:r>
-      <w:proofErr w:type="spellStart"/>
-      <w:r>
-        <w:rPr>
-          <w:rFonts w:ascii="Times New Roman" w:hAnsi="Times New Roman" w:cs="Times New Roman"/>
-          <w:lang w:val="en-US"/>
-        </w:rPr>
-        <w:t>m</w:t>
-      </w:r>
-      <w:r>
-        <w:rPr>
-          <w:rFonts w:ascii="Times New Roman" w:hAnsi="Times New Roman" w:cs="Times New Roman"/>
-          <w:lang w:val="en-US"/>
-        </w:rPr>
-        <w:t>idhinge</w:t>
-      </w:r>
-      <w:proofErr w:type="spellEnd"/>
-      <w:r>
-        <w:rPr>
-          <w:rFonts w:ascii="Times New Roman" w:hAnsi="Times New Roman" w:cs="Times New Roman"/>
-          <w:lang w:val="en-US"/>
-        </w:rPr>
-        <w:t xml:space="preserve"> multiplied by 2.5, where the </w:t>
-      </w:r>
-      <w:proofErr w:type="spellStart"/>
-      <w:r>
-        <w:rPr>
-          <w:rFonts w:ascii="Times New Roman" w:hAnsi="Times New Roman" w:cs="Times New Roman"/>
-          <w:lang w:val="en-US"/>
-        </w:rPr>
-        <w:t>midhinge</w:t>
-      </w:r>
-      <w:proofErr w:type="spellEnd"/>
-      <w:r>
-        <w:rPr>
-          <w:rFonts w:ascii="Times New Roman" w:hAnsi="Times New Roman" w:cs="Times New Roman"/>
-          <w:lang w:val="en-US"/>
-        </w:rPr>
-        <w:t xml:space="preserve"> is defined as (Q3−Q1)/2.</w:t>
+        <w:t xml:space="preserve"> Stock growth caped at the m</w:t>
+      </w:r>
+      <w:r>
+        <w:rPr>
+          <w:rFonts w:ascii="Times New Roman" w:hAnsi="Times New Roman" w:cs="Times New Roman"/>
+          <w:lang w:val="en-US"/>
+        </w:rPr>
+        <w:t>idhinge multiplied by 2.5, where the midhinge is defined as (Q3−Q1)/2.</w:t>
       </w:r>
     </w:p>
     <w:p>
@@ -6431,47 +6153,7 @@
           <w:szCs w:val="24"/>
           <w:lang w:val="en-US"/>
         </w:rPr>
-        <w:t xml:space="preserve">Buongiorno, Joseph; Zhu, </w:t>
-      </w:r>
-      <w:proofErr w:type="spellStart"/>
-      <w:r>
-        <w:rPr>
-          <w:rFonts w:ascii="Times New Roman" w:hAnsi="Times New Roman"/>
-          <w:sz w:val="24"/>
-          <w:szCs w:val="24"/>
-          <w:lang w:val="en-US"/>
-        </w:rPr>
-        <w:t>Shushuai</w:t>
-      </w:r>
-      <w:proofErr w:type="spellEnd"/>
-      <w:r>
-        <w:rPr>
-          <w:rFonts w:ascii="Times New Roman" w:hAnsi="Times New Roman"/>
-          <w:sz w:val="24"/>
-          <w:szCs w:val="24"/>
-          <w:lang w:val="en-US"/>
-        </w:rPr>
-        <w:t xml:space="preserve">; Zhang, Dali; Turner, James; </w:t>
-      </w:r>
-      <w:proofErr w:type="spellStart"/>
-      <w:r>
-        <w:rPr>
-          <w:rFonts w:ascii="Times New Roman" w:hAnsi="Times New Roman"/>
-          <w:sz w:val="24"/>
-          <w:szCs w:val="24"/>
-          <w:lang w:val="en-US"/>
-        </w:rPr>
-        <w:t>Tomberlin</w:t>
-      </w:r>
-      <w:proofErr w:type="spellEnd"/>
-      <w:r>
-        <w:rPr>
-          <w:rFonts w:ascii="Times New Roman" w:hAnsi="Times New Roman"/>
-          <w:sz w:val="24"/>
-          <w:szCs w:val="24"/>
-          <w:lang w:val="en-US"/>
-        </w:rPr>
-        <w:t>, David (2003): The global forest products model: Structure, estimation, and applications. Amsterdam and Boston and London: Academic Press.</w:t>
+        <w:t>Buongiorno, Joseph; Zhu, Shushuai; Zhang, Dali; Turner, James; Tomberlin, David (2003): The global forest products model: Structure, estimation, and applications. Amsterdam and Boston and London: Academic Press.</w:t>
       </w:r>
     </w:p>
     <w:p>
@@ -6575,7 +6257,6 @@
           <w:lang w:val="en-US"/>
         </w:rPr>
       </w:pPr>
-      <w:proofErr w:type="spellStart"/>
       <w:r>
         <w:rPr>
           <w:rFonts w:ascii="Times New Roman" w:hAnsi="Times New Roman"/>
@@ -6585,7 +6266,6 @@
         </w:rPr>
         <w:t>GlobalForestWatch</w:t>
       </w:r>
-      <w:proofErr w:type="spellEnd"/>
       <w:r>
         <w:rPr>
           <w:rFonts w:ascii="Times New Roman" w:hAnsi="Times New Roman"/>
@@ -6704,27 +6384,7 @@
           <w:szCs w:val="24"/>
           <w:lang w:val="en-US"/>
         </w:rPr>
-        <w:t xml:space="preserve">TI-FSM (2024): </w:t>
-      </w:r>
-      <w:proofErr w:type="spellStart"/>
-      <w:r>
-        <w:rPr>
-          <w:rFonts w:ascii="Times New Roman" w:hAnsi="Times New Roman"/>
-          <w:sz w:val="24"/>
-          <w:szCs w:val="24"/>
-          <w:lang w:val="en-US"/>
-        </w:rPr>
-        <w:t>TiMBA</w:t>
-      </w:r>
-      <w:proofErr w:type="spellEnd"/>
-      <w:r>
-        <w:rPr>
-          <w:rFonts w:ascii="Times New Roman" w:hAnsi="Times New Roman"/>
-          <w:sz w:val="24"/>
-          <w:szCs w:val="24"/>
-          <w:lang w:val="en-US"/>
-        </w:rPr>
-        <w:t xml:space="preserve"> (Timber market Model for policy-Based Analysis). doi.org/10.5281/zenodo.13842384. Available online at https://github.com/TI-Forest-Sector-Modelling/TiMBA</w:t>
+        <w:t>TI-FSM (2024): TiMBA (Timber market Model for policy-Based Analysis). doi.org/10.5281/zenodo.13842384. Available online at https://github.com/TI-Forest-Sector-Modelling/TiMBA</w:t>
       </w:r>
     </w:p>
     <w:p>

</xml_diff>